<commit_message>
docx: add picture C4 level and report main
</commit_message>
<xml_diff>
--- a/Documents/ClassN01_Group_7_Lab_report_2.docx
+++ b/Documents/ClassN01_Group_7_Lab_report_2.docx
@@ -3171,13 +3171,19 @@
     </w:p>
     <w:p>
       <w:pPr>
-        <w:rPr>
-          <w:sz w:val="26"/>
-          <w:szCs w:val="26"/>
-        </w:rPr>
-      </w:pPr>
-      <w:r>
-        <w:rPr>
+        <w:pStyle w:val="Heading1"/>
+        <w:spacing w:before="60" w:after="60"/>
+        <w:rPr>
+          <w:rFonts w:ascii="Times New Roman" w:eastAsia="Times New Roman" w:hAnsi="Times New Roman" w:cs="Times New Roman"/>
+          <w:color w:val="auto"/>
+          <w:sz w:val="26"/>
+          <w:szCs w:val="26"/>
+        </w:rPr>
+      </w:pPr>
+      <w:r>
+        <w:rPr>
+          <w:rFonts w:ascii="Times New Roman" w:eastAsia="Times New Roman" w:hAnsi="Times New Roman" w:cs="Times New Roman"/>
+          <w:color w:val="auto"/>
           <w:sz w:val="26"/>
           <w:szCs w:val="26"/>
         </w:rPr>
@@ -3186,175 +3192,282 @@
     </w:p>
     <w:p>
       <w:pPr>
-        <w:numPr>
-          <w:ilvl w:val="0"/>
-          <w:numId w:val="2"/>
-        </w:numPr>
-        <w:spacing w:before="240"/>
-        <w:rPr>
-          <w:sz w:val="26"/>
-          <w:szCs w:val="26"/>
-        </w:rPr>
-      </w:pPr>
-      <w:r>
-        <w:rPr>
-          <w:sz w:val="26"/>
-          <w:szCs w:val="26"/>
-        </w:rPr>
-        <w:t>Client Request: The user (Guest/Staff Portal) sends an HTTP GET request to the endpoint: /rooms/availability?checkin=2025-12-20&amp;roomType=DELUXE.</w:t>
-      </w:r>
-    </w:p>
-    <w:p>
-      <w:pPr>
-        <w:numPr>
-          <w:ilvl w:val="0"/>
-          <w:numId w:val="2"/>
-        </w:numPr>
-        <w:rPr>
-          <w:sz w:val="26"/>
-          <w:szCs w:val="26"/>
-        </w:rPr>
-      </w:pPr>
-      <w:r>
-        <w:rPr>
-          <w:sz w:val="26"/>
-          <w:szCs w:val="26"/>
-        </w:rPr>
-        <w:t>Layer 1 (Presentation): The RoomController receives the request, performs user session authentication, and validates the date format. It then invokes Layer 2.</w:t>
-      </w:r>
-    </w:p>
-    <w:p>
-      <w:pPr>
-        <w:numPr>
-          <w:ilvl w:val="0"/>
-          <w:numId w:val="2"/>
-        </w:numPr>
-        <w:rPr>
-          <w:sz w:val="26"/>
-          <w:szCs w:val="26"/>
-        </w:rPr>
-      </w:pPr>
-      <w:r>
-        <w:rPr>
-          <w:sz w:val="26"/>
-          <w:szCs w:val="26"/>
-        </w:rPr>
-        <w:t>Layer 2 (Business Logic): The RoomService executes the findAvailableRooms(checkin, type) function. Here, the system applies business rules, such as checking for minimum stay duration requirements.</w:t>
-      </w:r>
-    </w:p>
-    <w:p>
-      <w:pPr>
-        <w:numPr>
-          <w:ilvl w:val="0"/>
-          <w:numId w:val="2"/>
-        </w:numPr>
-        <w:rPr>
-          <w:sz w:val="26"/>
-          <w:szCs w:val="26"/>
-        </w:rPr>
-      </w:pPr>
-      <w:r>
-        <w:rPr>
-          <w:sz w:val="26"/>
-          <w:szCs w:val="26"/>
-        </w:rPr>
-        <w:t>Layer 3 (Persistence): The RoomRepository (shown within the Business Logic flow in the diagram but effectively handling data access) receives the command and constructs a complex SQL query: SELECT r.* FROM rooms r LEFT JOIN reservations res WHERE ... AND roomType = ?.</w:t>
-      </w:r>
-    </w:p>
-    <w:p>
-      <w:pPr>
-        <w:numPr>
-          <w:ilvl w:val="0"/>
-          <w:numId w:val="2"/>
-        </w:numPr>
-        <w:rPr>
-          <w:sz w:val="26"/>
-          <w:szCs w:val="26"/>
-        </w:rPr>
-      </w:pPr>
-      <w:r>
-        <w:rPr>
-          <w:sz w:val="26"/>
-          <w:szCs w:val="26"/>
-        </w:rPr>
-        <w:t>Layer 4 (Data): The Database (PostgreSQL) executes the JOIN command to filter for rooms that are not booked during the specified period and returns the raw data.</w:t>
-      </w:r>
-    </w:p>
-    <w:p>
-      <w:pPr>
-        <w:numPr>
-          <w:ilvl w:val="0"/>
-          <w:numId w:val="2"/>
-        </w:numPr>
-        <w:rPr>
-          <w:sz w:val="26"/>
-          <w:szCs w:val="26"/>
-        </w:rPr>
-      </w:pPr>
-      <w:r>
-        <w:rPr>
-          <w:sz w:val="26"/>
-          <w:szCs w:val="26"/>
-        </w:rPr>
+        <w:pStyle w:val="Heading1"/>
+        <w:spacing w:before="60" w:after="60"/>
+        <w:rPr>
+          <w:rFonts w:ascii="Times New Roman" w:eastAsia="Times New Roman" w:hAnsi="Times New Roman" w:cs="Times New Roman"/>
+          <w:color w:val="auto"/>
+          <w:sz w:val="26"/>
+          <w:szCs w:val="26"/>
+        </w:rPr>
+      </w:pPr>
+      <w:r>
+        <w:rPr>
+          <w:rFonts w:ascii="Times New Roman" w:eastAsia="Times New Roman" w:hAnsi="Times New Roman" w:cs="Times New Roman"/>
+          <w:color w:val="auto"/>
+          <w:sz w:val="26"/>
+          <w:szCs w:val="26"/>
+        </w:rPr>
+        <w:t>●</w:t>
+      </w:r>
+      <w:r>
+        <w:rPr>
+          <w:rFonts w:ascii="Times New Roman" w:eastAsia="Times New Roman" w:hAnsi="Times New Roman" w:cs="Times New Roman"/>
+          <w:color w:val="auto"/>
+          <w:sz w:val="26"/>
+          <w:szCs w:val="26"/>
+        </w:rPr>
+        <w:tab/>
+        <w:t>Client Request: The user (Guest/Staff Portal) sends an HTTP GET request to the endpoint: /api/rooms/search?room_type=DELUXE&amp;status=available (optional: &amp;check_in=2025-12-20&amp;check_out=2025-12-22 for date-range availability).</w:t>
+      </w:r>
+    </w:p>
+    <w:p>
+      <w:pPr>
+        <w:pStyle w:val="Heading1"/>
+        <w:spacing w:before="60" w:after="60"/>
+        <w:rPr>
+          <w:rFonts w:ascii="Times New Roman" w:eastAsia="Times New Roman" w:hAnsi="Times New Roman" w:cs="Times New Roman"/>
+          <w:color w:val="auto"/>
+          <w:sz w:val="26"/>
+          <w:szCs w:val="26"/>
+        </w:rPr>
+      </w:pPr>
+      <w:r>
+        <w:rPr>
+          <w:rFonts w:ascii="Times New Roman" w:eastAsia="Times New Roman" w:hAnsi="Times New Roman" w:cs="Times New Roman"/>
+          <w:color w:val="auto"/>
+          <w:sz w:val="26"/>
+          <w:szCs w:val="26"/>
+        </w:rPr>
+        <w:t>●</w:t>
+      </w:r>
+      <w:r>
+        <w:rPr>
+          <w:rFonts w:ascii="Times New Roman" w:eastAsia="Times New Roman" w:hAnsi="Times New Roman" w:cs="Times New Roman"/>
+          <w:color w:val="auto"/>
+          <w:sz w:val="26"/>
+          <w:szCs w:val="26"/>
+        </w:rPr>
+        <w:tab/>
+        <w:t>Layer 1 (Presentation): The RoomController receives the request, applies auth middleware (X-User-Id) where required, and validates the request parameters. It then invokes Layer 2.</w:t>
+      </w:r>
+    </w:p>
+    <w:p>
+      <w:pPr>
+        <w:pStyle w:val="Heading1"/>
+        <w:spacing w:before="60" w:after="60"/>
+        <w:rPr>
+          <w:rFonts w:ascii="Times New Roman" w:eastAsia="Times New Roman" w:hAnsi="Times New Roman" w:cs="Times New Roman"/>
+          <w:color w:val="auto"/>
+          <w:sz w:val="26"/>
+          <w:szCs w:val="26"/>
+        </w:rPr>
+      </w:pPr>
+      <w:r>
+        <w:rPr>
+          <w:rFonts w:ascii="Times New Roman" w:eastAsia="Times New Roman" w:hAnsi="Times New Roman" w:cs="Times New Roman"/>
+          <w:color w:val="auto"/>
+          <w:sz w:val="26"/>
+          <w:szCs w:val="26"/>
+        </w:rPr>
+        <w:t>●</w:t>
+      </w:r>
+      <w:r>
+        <w:rPr>
+          <w:rFonts w:ascii="Times New Roman" w:eastAsia="Times New Roman" w:hAnsi="Times New Roman" w:cs="Times New Roman"/>
+          <w:color w:val="auto"/>
+          <w:sz w:val="26"/>
+          <w:szCs w:val="26"/>
+        </w:rPr>
+        <w:tab/>
+        <w:t>Layer 2 (Business Logic): The RoomService executes search_rooms(room_type, status, check_in_date, check_out_date). The system applies business rules: filtering by room type and status, and when dates are provided, checking availability by date range (no overlap with existing bookings).</w:t>
+      </w:r>
+    </w:p>
+    <w:p>
+      <w:pPr>
+        <w:pStyle w:val="Heading1"/>
+        <w:spacing w:before="60" w:after="60"/>
+        <w:rPr>
+          <w:rFonts w:ascii="Times New Roman" w:eastAsia="Times New Roman" w:hAnsi="Times New Roman" w:cs="Times New Roman"/>
+          <w:color w:val="auto"/>
+          <w:sz w:val="26"/>
+          <w:szCs w:val="26"/>
+        </w:rPr>
+      </w:pPr>
+      <w:r>
+        <w:rPr>
+          <w:rFonts w:ascii="Times New Roman" w:eastAsia="Times New Roman" w:hAnsi="Times New Roman" w:cs="Times New Roman"/>
+          <w:color w:val="auto"/>
+          <w:sz w:val="26"/>
+          <w:szCs w:val="26"/>
+        </w:rPr>
+        <w:t>●</w:t>
+      </w:r>
+      <w:r>
+        <w:rPr>
+          <w:rFonts w:ascii="Times New Roman" w:eastAsia="Times New Roman" w:hAnsi="Times New Roman" w:cs="Times New Roman"/>
+          <w:color w:val="auto"/>
+          <w:sz w:val="26"/>
+          <w:szCs w:val="26"/>
+        </w:rPr>
+        <w:tab/>
+        <w:t>Layer 3 (Persistence): For availability by date range, the BookingRepository constructs and runs the SQL (e.g. SELECT r.* FROM rooms r LEFT JOIN bookings ... WHERE r.room_type = %s AND ...) to find rooms free in that period. For search by type/status only, the RoomRepository runs queries (e.g. find_by_type, find_all) against the database.</w:t>
+      </w:r>
+    </w:p>
+    <w:p>
+      <w:pPr>
+        <w:pStyle w:val="Heading1"/>
+        <w:spacing w:before="60" w:after="60"/>
+        <w:rPr>
+          <w:rFonts w:ascii="Times New Roman" w:eastAsia="Times New Roman" w:hAnsi="Times New Roman" w:cs="Times New Roman"/>
+          <w:color w:val="auto"/>
+          <w:sz w:val="26"/>
+          <w:szCs w:val="26"/>
+        </w:rPr>
+      </w:pPr>
+      <w:r>
+        <w:rPr>
+          <w:rFonts w:ascii="Times New Roman" w:eastAsia="Times New Roman" w:hAnsi="Times New Roman" w:cs="Times New Roman"/>
+          <w:color w:val="auto"/>
+          <w:sz w:val="26"/>
+          <w:szCs w:val="26"/>
+        </w:rPr>
+        <w:t>●</w:t>
+      </w:r>
+      <w:r>
+        <w:rPr>
+          <w:rFonts w:ascii="Times New Roman" w:eastAsia="Times New Roman" w:hAnsi="Times New Roman" w:cs="Times New Roman"/>
+          <w:color w:val="auto"/>
+          <w:sz w:val="26"/>
+          <w:szCs w:val="26"/>
+        </w:rPr>
+        <w:tab/>
+        <w:t>Layer 4 (Data): The MySQL database (hotel_management) executes the query and returns the raw rows.</w:t>
+      </w:r>
+    </w:p>
+    <w:p>
+      <w:pPr>
+        <w:pStyle w:val="Heading1"/>
+        <w:spacing w:before="60" w:after="60"/>
+        <w:rPr>
+          <w:rFonts w:ascii="Times New Roman" w:eastAsia="Times New Roman" w:hAnsi="Times New Roman" w:cs="Times New Roman"/>
+          <w:color w:val="auto"/>
+          <w:sz w:val="26"/>
+          <w:szCs w:val="26"/>
+        </w:rPr>
+      </w:pPr>
+      <w:r>
+        <w:rPr>
+          <w:rFonts w:ascii="Times New Roman" w:eastAsia="Times New Roman" w:hAnsi="Times New Roman" w:cs="Times New Roman"/>
+          <w:color w:val="auto"/>
+          <w:sz w:val="26"/>
+          <w:szCs w:val="26"/>
+        </w:rPr>
+        <w:t>●</w:t>
+      </w:r>
+      <w:r>
+        <w:rPr>
+          <w:rFonts w:ascii="Times New Roman" w:eastAsia="Times New Roman" w:hAnsi="Times New Roman" w:cs="Times New Roman"/>
+          <w:color w:val="auto"/>
+          <w:sz w:val="26"/>
+          <w:szCs w:val="26"/>
+        </w:rPr>
+        <w:tab/>
         <w:t>Return Path:</w:t>
       </w:r>
     </w:p>
     <w:p>
       <w:pPr>
-        <w:numPr>
-          <w:ilvl w:val="1"/>
-          <w:numId w:val="2"/>
-        </w:numPr>
-        <w:rPr>
-          <w:sz w:val="26"/>
-          <w:szCs w:val="26"/>
-        </w:rPr>
-      </w:pPr>
-      <w:r>
-        <w:rPr>
-          <w:sz w:val="26"/>
-          <w:szCs w:val="26"/>
-        </w:rPr>
-        <w:t>The RoomRepository maps the raw data from the Database into Room Objects.</w:t>
-      </w:r>
-    </w:p>
-    <w:p>
-      <w:pPr>
-        <w:numPr>
-          <w:ilvl w:val="1"/>
-          <w:numId w:val="2"/>
-        </w:numPr>
-        <w:rPr>
-          <w:sz w:val="26"/>
-          <w:szCs w:val="26"/>
-        </w:rPr>
-      </w:pPr>
-      <w:r>
-        <w:rPr>
-          <w:sz w:val="26"/>
-          <w:szCs w:val="26"/>
-        </w:rPr>
-        <w:t>The RoomService calculates the final pricing (Pricing Logic).</w:t>
-      </w:r>
-    </w:p>
-    <w:p>
-      <w:pPr>
-        <w:numPr>
-          <w:ilvl w:val="1"/>
-          <w:numId w:val="2"/>
-        </w:numPr>
-        <w:spacing w:after="240"/>
-        <w:rPr>
-          <w:sz w:val="26"/>
-          <w:szCs w:val="26"/>
-        </w:rPr>
-      </w:pPr>
-      <w:r>
-        <w:rPr>
-          <w:sz w:val="26"/>
-          <w:szCs w:val="26"/>
-        </w:rPr>
-        <w:t>The RoomController returns the "Available rooms response" (JSON/HTML) to the Client.</w:t>
+        <w:pStyle w:val="Heading1"/>
+        <w:spacing w:before="60" w:after="60"/>
+        <w:rPr>
+          <w:rFonts w:ascii="Times New Roman" w:eastAsia="Times New Roman" w:hAnsi="Times New Roman" w:cs="Times New Roman"/>
+          <w:color w:val="auto"/>
+          <w:sz w:val="26"/>
+          <w:szCs w:val="26"/>
+        </w:rPr>
+      </w:pPr>
+      <w:r>
+        <w:rPr>
+          <w:rFonts w:ascii="Times New Roman" w:eastAsia="Times New Roman" w:hAnsi="Times New Roman" w:cs="Times New Roman"/>
+          <w:color w:val="auto"/>
+          <w:sz w:val="26"/>
+          <w:szCs w:val="26"/>
+        </w:rPr>
+        <w:t>○</w:t>
+      </w:r>
+      <w:r>
+        <w:rPr>
+          <w:rFonts w:ascii="Times New Roman" w:eastAsia="Times New Roman" w:hAnsi="Times New Roman" w:cs="Times New Roman"/>
+          <w:color w:val="auto"/>
+          <w:sz w:val="26"/>
+          <w:szCs w:val="26"/>
+        </w:rPr>
+        <w:tab/>
+        <w:t>The repository (BookingRepository or RoomRepository) maps the raw rows into Room objects.</w:t>
+      </w:r>
+    </w:p>
+    <w:p>
+      <w:pPr>
+        <w:pStyle w:val="Heading1"/>
+        <w:spacing w:before="60" w:after="60"/>
+        <w:rPr>
+          <w:rFonts w:ascii="Times New Roman" w:eastAsia="Times New Roman" w:hAnsi="Times New Roman" w:cs="Times New Roman"/>
+          <w:color w:val="auto"/>
+          <w:sz w:val="26"/>
+          <w:szCs w:val="26"/>
+        </w:rPr>
+      </w:pPr>
+      <w:r>
+        <w:rPr>
+          <w:rFonts w:ascii="Times New Roman" w:eastAsia="Times New Roman" w:hAnsi="Times New Roman" w:cs="Times New Roman"/>
+          <w:color w:val="auto"/>
+          <w:sz w:val="26"/>
+          <w:szCs w:val="26"/>
+        </w:rPr>
+        <w:t>○</w:t>
+      </w:r>
+      <w:r>
+        <w:rPr>
+          <w:rFonts w:ascii="Times New Roman" w:eastAsia="Times New Roman" w:hAnsi="Times New Roman" w:cs="Times New Roman"/>
+          <w:color w:val="auto"/>
+          <w:sz w:val="26"/>
+          <w:szCs w:val="26"/>
+        </w:rPr>
+        <w:tab/>
+        <w:t>The RoomService returns the list of rooms (each room includes price from the model).</w:t>
+      </w:r>
+    </w:p>
+    <w:p>
+      <w:pPr>
+        <w:pStyle w:val="Heading1"/>
+        <w:spacing w:before="60" w:after="60"/>
+        <w:rPr>
+          <w:rFonts w:ascii="Times New Roman" w:eastAsia="Times New Roman" w:hAnsi="Times New Roman" w:cs="Times New Roman"/>
+          <w:color w:val="auto"/>
+          <w:sz w:val="26"/>
+          <w:szCs w:val="26"/>
+          <w:lang w:val="en-US"/>
+        </w:rPr>
+      </w:pPr>
+      <w:r>
+        <w:rPr>
+          <w:rFonts w:ascii="Times New Roman" w:eastAsia="Times New Roman" w:hAnsi="Times New Roman" w:cs="Times New Roman"/>
+          <w:color w:val="auto"/>
+          <w:sz w:val="26"/>
+          <w:szCs w:val="26"/>
+        </w:rPr>
+        <w:t>○</w:t>
+      </w:r>
+      <w:r>
+        <w:rPr>
+          <w:rFonts w:ascii="Times New Roman" w:eastAsia="Times New Roman" w:hAnsi="Times New Roman" w:cs="Times New Roman"/>
+          <w:color w:val="auto"/>
+          <w:sz w:val="26"/>
+          <w:szCs w:val="26"/>
+        </w:rPr>
+        <w:tab/>
+        <w:t>The RoomController returns the "Available rooms" response (JSON) to the client.</w:t>
       </w:r>
     </w:p>
     <w:p>
@@ -3556,6 +3669,7 @@
           <w:sz w:val="26"/>
           <w:szCs w:val="26"/>
         </w:rPr>
+        <w:lastRenderedPageBreak/>
         <w:t>Responsibility: Encapsulates the logic for communicating with the external Payment Gateway (Actor), ensuring security and isolating third-party dependencies.</w:t>
       </w:r>
     </w:p>
@@ -3586,7 +3700,6 @@
           <w:sz w:val="26"/>
           <w:szCs w:val="26"/>
         </w:rPr>
-        <w:lastRenderedPageBreak/>
         <w:t>Component Name: BookingRepository</w:t>
       </w:r>
     </w:p>
@@ -3858,6 +3971,7 @@
           <w:sz w:val="30"/>
           <w:szCs w:val="30"/>
         </w:rPr>
+        <w:lastRenderedPageBreak/>
         <w:t>5. Conclusion &amp; Reflection</w:t>
       </w:r>
     </w:p>
@@ -3896,7 +4010,6 @@
           <w:sz w:val="26"/>
           <w:szCs w:val="26"/>
         </w:rPr>
-        <w:lastRenderedPageBreak/>
         <w:t>Modifiability (ASR-3): By separating the Presentation Layer (HTML/CSS) from the Business Logic Layer (Python), we ensure that changes to the user interface do not affect backend logic. Furthermore, encapsulating the Payment Gateway interaction within the PaymentService ensures that switching payment providers does not impact other parts of the system.</w:t>
       </w:r>
     </w:p>

</xml_diff>